<commit_message>
Tema 2-3 ders, soru ve dijital dosyalarindaki grafikler baski boyutunda yeniden cizildi; yazilar sayfada 9-10,5 punto basiliyor
</commit_message>
<xml_diff>
--- a/Kim11-2-10-Notrallesme.docx
+++ b/Kim11-2-10-Notrallesme.docx
@@ -2762,7 +2762,7 @@
       <w:r>
         <w:drawing>
           <wp:inline distT="0" distB="0" distL="0" distR="0">
-            <wp:extent cx="4320000" cy="2646720"/>
+            <wp:extent cx="4319024" cy="2627381"/>
             <wp:docPr id="900001" name="Grafik 900001" descr="Boş pH-hacim grafik alanı"/>
             <wp:cNvGraphicFramePr>
               <a:graphicFrameLocks noChangeAspect="1"/>
@@ -2783,7 +2783,7 @@
                   <pic:spPr>
                     <a:xfrm>
                       <a:off x="0" y="0"/>
-                      <a:ext cx="4320000" cy="2646720"/>
+                      <a:ext cx="4319024" cy="2627381"/>
                     </a:xfrm>
                     <a:prstGeom prst="rect">
                       <a:avLst/>
@@ -2807,7 +2807,7 @@
       <w:r>
         <w:drawing>
           <wp:inline distT="0" distB="0" distL="0" distR="0">
-            <wp:extent cx="4320000" cy="2646720"/>
+            <wp:extent cx="4319024" cy="2627381"/>
             <wp:docPr id="900002" name="Grafik 900002" descr="Boş iletkenlik-hacim grafik alanı"/>
             <wp:cNvGraphicFramePr>
               <a:graphicFrameLocks noChangeAspect="1"/>
@@ -2828,7 +2828,7 @@
                   <pic:spPr>
                     <a:xfrm>
                       <a:off x="0" y="0"/>
-                      <a:ext cx="4320000" cy="2646720"/>
+                      <a:ext cx="4319024" cy="2627381"/>
                     </a:xfrm>
                     <a:prstGeom prst="rect">
                       <a:avLst/>
@@ -3742,7 +3742,7 @@
       <w:r>
         <w:drawing>
           <wp:inline distT="0" distB="0" distL="0" distR="0">
-            <wp:extent cx="5400000" cy="2016000"/>
+            <wp:extent cx="5398018" cy="2697485"/>
             <wp:docPr id="900005" name="Grafik 900005" descr="HBr-KOH nötralleşmesi alt mikro model"/>
             <wp:cNvGraphicFramePr>
               <a:graphicFrameLocks noChangeAspect="1"/>
@@ -3763,7 +3763,7 @@
                   <pic:spPr>
                     <a:xfrm>
                       <a:off x="0" y="0"/>
-                      <a:ext cx="5400000" cy="2016000"/>
+                      <a:ext cx="5398018" cy="2697485"/>
                     </a:xfrm>
                     <a:prstGeom prst="rect">
                       <a:avLst/>
@@ -4665,7 +4665,7 @@
       <w:r>
         <w:drawing>
           <wp:inline distT="0" distB="0" distL="0" distR="0">
-            <wp:extent cx="4680000" cy="2808000"/>
+            <wp:extent cx="4678689" cy="2807213"/>
             <wp:docPr id="900006" name="Grafik 900006" descr="HBr-KOH iletkenlik-hacim grafiği"/>
             <wp:cNvGraphicFramePr>
               <a:graphicFrameLocks noChangeAspect="1"/>
@@ -4686,7 +4686,7 @@
                   <pic:spPr>
                     <a:xfrm>
                       <a:off x="0" y="0"/>
-                      <a:ext cx="4680000" cy="2808000"/>
+                      <a:ext cx="4678689" cy="2807213"/>
                     </a:xfrm>
                     <a:prstGeom prst="rect">
                       <a:avLst/>

</xml_diff>

<commit_message>
Konu girislerinde gorseller yan yana cift gorsel duzenine alindi (2.4-2.14, 3.1-3.3); tek gorselli konulara ikinci Shutter gorseli eklendi, sonraki gorsel harfleri ve metin atiflari kaydirildi
</commit_message>
<xml_diff>
--- a/Kim11-2-10-Notrallesme.docx
+++ b/Kim11-2-10-Notrallesme.docx
@@ -44,24 +44,98 @@
         <w:tblW w:w="9000" w:type="dxa"/>
         <w:jc w:val="center"/>
         <w:tblBorders>
-          <w:top w:val="single" w:sz="8" w:space="0" w:color="7F7F7F"/>
-          <w:left w:val="single" w:sz="8" w:space="0" w:color="7F7F7F"/>
-          <w:bottom w:val="single" w:sz="8" w:space="0" w:color="7F7F7F"/>
-          <w:right w:val="single" w:sz="8" w:space="0" w:color="7F7F7F"/>
+          <w:top w:val="nil"/>
+          <w:left w:val="nil"/>
+          <w:bottom w:val="nil"/>
+          <w:right w:val="nil"/>
+          <w:insideH w:val="nil"/>
+          <w:insideV w:val="nil"/>
         </w:tblBorders>
+        <w:tblLayout w:type="fixed"/>
       </w:tblPr>
       <w:tblGrid>
-        <w:gridCol w:w="9000"/>
+        <w:gridCol w:w="4500"/>
+        <w:gridCol w:w="4500"/>
       </w:tblGrid>
       <w:tr>
         <w:tc>
           <w:tcPr>
-            <w:tcW w:w="9000" w:type="dxa"/>
-            <w:shd w:val="clear" w:color="auto" w:fill="EDEDED"/>
+            <w:tcW w:w="4500" w:type="dxa"/>
           </w:tcPr>
+          <w:tbl>
+            <w:tblPr>
+              <w:tblW w:w="4300" w:type="dxa"/>
+              <w:jc w:val="center"/>
+              <w:tblBorders>
+                <w:top w:val="single" w:sz="8" w:space="0" w:color="7F7F7F"/>
+                <w:left w:val="single" w:sz="8" w:space="0" w:color="7F7F7F"/>
+                <w:bottom w:val="single" w:sz="8" w:space="0" w:color="7F7F7F"/>
+                <w:right w:val="single" w:sz="8" w:space="0" w:color="7F7F7F"/>
+              </w:tblBorders>
+            </w:tblPr>
+            <w:tblGrid>
+              <w:gridCol w:w="4300"/>
+            </w:tblGrid>
+            <w:tr>
+              <w:tc>
+                <w:tcPr>
+                  <w:tcW w:w="4300" w:type="dxa"/>
+                  <w:shd w:val="clear" w:color="auto" w:fill="EDEDED"/>
+                </w:tcPr>
+                <w:p>
+                  <w:pPr>
+                    <w:jc w:val="both"/>
+                    <w:rPr>
+                      <w:rFonts w:ascii="Times New Roman" w:hAnsi="Times New Roman" w:cs="Times New Roman"/>
+                      <w:lang w:val="tr-TR"/>
+                    </w:rPr>
+                  </w:pPr>
+                  <w:r>
+                    <w:rPr>
+                      <w:rFonts w:ascii="Times New Roman" w:hAnsi="Times New Roman" w:cs="Times New Roman"/>
+                      <w:lang w:val="tr-TR"/>
+                    </w:rPr>
+                    <w:t xml:space="preserve">GÖRSEL ALANI (Shutterstock)</w:t>
+                  </w:r>
+                </w:p>
+                <w:p>
+                  <w:pPr>
+                    <w:jc w:val="both"/>
+                    <w:rPr>
+                      <w:rFonts w:ascii="Times New Roman" w:hAnsi="Times New Roman" w:cs="Times New Roman"/>
+                      <w:lang w:val="tr-TR"/>
+                    </w:rPr>
+                  </w:pPr>
+                  <w:r>
+                    <w:rPr>
+                      <w:rFonts w:ascii="Times New Roman" w:hAnsi="Times New Roman" w:cs="Times New Roman"/>
+                      <w:lang w:val="tr-TR"/>
+                    </w:rPr>
+                    <w:t xml:space="preserve">Tarif: Bir bardak su yanında çiğnenebilir antasit tabletler; marka ve logo görünmesin.</w:t>
+                  </w:r>
+                </w:p>
+                <w:p>
+                  <w:pPr>
+                    <w:jc w:val="both"/>
+                    <w:rPr>
+                      <w:rFonts w:ascii="Times New Roman" w:hAnsi="Times New Roman" w:cs="Times New Roman"/>
+                      <w:lang w:val="tr-TR"/>
+                    </w:rPr>
+                  </w:pPr>
+                  <w:r>
+                    <w:rPr>
+                      <w:rFonts w:ascii="Times New Roman" w:hAnsi="Times New Roman" w:cs="Times New Roman"/>
+                      <w:lang w:val="tr-TR"/>
+                    </w:rPr>
+                    <w:t xml:space="preserve">Shutter ID: 188016662 (fotoğraf) — Effervescent antacid tablet in glass of water</w:t>
+                  </w:r>
+                </w:p>
+              </w:tc>
+            </w:tr>
+          </w:tbl>
           <w:p>
             <w:pPr>
-              <w:jc w:val="both"/>
+              <w:jc w:val="center"/>
               <w:rPr>
                 <w:rFonts w:ascii="Times New Roman" w:hAnsi="Times New Roman" w:cs="Times New Roman"/>
                 <w:lang w:val="tr-TR"/>
@@ -70,14 +144,99 @@
             <w:r>
               <w:rPr>
                 <w:rFonts w:ascii="Times New Roman" w:hAnsi="Times New Roman" w:cs="Times New Roman"/>
-                <w:lang w:val="tr-TR"/>
-              </w:rPr>
-              <w:t xml:space="preserve">GÖRSEL ALANI (Shutterstock)</w:t>
+                <w:b/>
+                <w:bCs/>
+                <w:lang w:val="tr-TR"/>
+              </w:rPr>
+              <w:t xml:space="preserve">Görsel A:</w:t>
+            </w:r>
+            <w:r>
+              <w:rPr>
+                <w:rFonts w:ascii="Times New Roman" w:hAnsi="Times New Roman" w:cs="Times New Roman"/>
+                <w:lang w:val="tr-TR"/>
+              </w:rPr>
+              <w:t xml:space="preserve"> Mide rahatsızlığında kullanılan antasit tabletler</w:t>
             </w:r>
           </w:p>
+        </w:tc>
+        <w:tc>
+          <w:tcPr>
+            <w:tcW w:w="4500" w:type="dxa"/>
+          </w:tcPr>
+          <w:tbl>
+            <w:tblPr>
+              <w:tblW w:w="4300" w:type="dxa"/>
+              <w:jc w:val="center"/>
+              <w:tblBorders>
+                <w:top w:val="single" w:sz="8" w:space="0" w:color="7F7F7F"/>
+                <w:left w:val="single" w:sz="8" w:space="0" w:color="7F7F7F"/>
+                <w:bottom w:val="single" w:sz="8" w:space="0" w:color="7F7F7F"/>
+                <w:right w:val="single" w:sz="8" w:space="0" w:color="7F7F7F"/>
+              </w:tblBorders>
+            </w:tblPr>
+            <w:tblGrid>
+              <w:gridCol w:w="4300"/>
+            </w:tblGrid>
+            <w:tr>
+              <w:tc>
+                <w:tcPr>
+                  <w:tcW w:w="4300" w:type="dxa"/>
+                  <w:shd w:val="clear" w:color="auto" w:fill="EDEDED"/>
+                </w:tcPr>
+                <w:p>
+                  <w:pPr>
+                    <w:jc w:val="both"/>
+                    <w:rPr>
+                      <w:rFonts w:ascii="Times New Roman" w:hAnsi="Times New Roman" w:cs="Times New Roman"/>
+                      <w:lang w:val="tr-TR"/>
+                    </w:rPr>
+                  </w:pPr>
+                  <w:r>
+                    <w:rPr>
+                      <w:rFonts w:ascii="Times New Roman" w:hAnsi="Times New Roman" w:cs="Times New Roman"/>
+                      <w:lang w:val="tr-TR"/>
+                    </w:rPr>
+                    <w:t xml:space="preserve">GÖRSEL ALANI (Shutterstock)</w:t>
+                  </w:r>
+                </w:p>
+                <w:p>
+                  <w:pPr>
+                    <w:jc w:val="both"/>
+                    <w:rPr>
+                      <w:rFonts w:ascii="Times New Roman" w:hAnsi="Times New Roman" w:cs="Times New Roman"/>
+                      <w:lang w:val="tr-TR"/>
+                    </w:rPr>
+                  </w:pPr>
+                  <w:r>
+                    <w:rPr>
+                      <w:rFonts w:ascii="Times New Roman" w:hAnsi="Times New Roman" w:cs="Times New Roman"/>
+                      <w:lang w:val="tr-TR"/>
+                    </w:rPr>
+                    <w:t xml:space="preserve">Tarif: Tarlaya ya da bahçe toprağına beyaz toz hâlinde tarım kireci serpen eller veya traktör.</w:t>
+                  </w:r>
+                </w:p>
+                <w:p>
+                  <w:pPr>
+                    <w:jc w:val="both"/>
+                    <w:rPr>
+                      <w:rFonts w:ascii="Times New Roman" w:hAnsi="Times New Roman" w:cs="Times New Roman"/>
+                      <w:lang w:val="tr-TR"/>
+                    </w:rPr>
+                  </w:pPr>
+                  <w:r>
+                    <w:rPr>
+                      <w:rFonts w:ascii="Times New Roman" w:hAnsi="Times New Roman" w:cs="Times New Roman"/>
+                      <w:lang w:val="tr-TR"/>
+                    </w:rPr>
+                    <w:t xml:space="preserve">Shutter ID: 2565145733 (fotoğraf) — Hand holding dolomite lime spread over soil</w:t>
+                  </w:r>
+                </w:p>
+              </w:tc>
+            </w:tr>
+          </w:tbl>
           <w:p>
             <w:pPr>
-              <w:jc w:val="both"/>
+              <w:jc w:val="center"/>
               <w:rPr>
                 <w:rFonts w:ascii="Times New Roman" w:hAnsi="Times New Roman" w:cs="Times New Roman"/>
                 <w:lang w:val="tr-TR"/>
@@ -86,169 +245,23 @@
             <w:r>
               <w:rPr>
                 <w:rFonts w:ascii="Times New Roman" w:hAnsi="Times New Roman" w:cs="Times New Roman"/>
-                <w:lang w:val="tr-TR"/>
-              </w:rPr>
-              <w:t xml:space="preserve">Tarif: Bir bardak su yanında çiğnenebilir antasit tabletler; marka ve logo görünmesin.</w:t>
+                <w:b/>
+                <w:bCs/>
+                <w:lang w:val="tr-TR"/>
+              </w:rPr>
+              <w:t xml:space="preserve">Görsel B:</w:t>
             </w:r>
-          </w:p>
-          <w:p>
-            <w:pPr>
-              <w:jc w:val="both"/>
-              <w:rPr>
-                <w:rFonts w:ascii="Times New Roman" w:hAnsi="Times New Roman" w:cs="Times New Roman"/>
-                <w:lang w:val="tr-TR"/>
-              </w:rPr>
-            </w:pPr>
             <w:r>
               <w:rPr>
                 <w:rFonts w:ascii="Times New Roman" w:hAnsi="Times New Roman" w:cs="Times New Roman"/>
                 <w:lang w:val="tr-TR"/>
               </w:rPr>
-              <w:t xml:space="preserve">Shutter ID: 188016662 (fotoğraf) — Effervescent antacid tablet in glass of water</w:t>
+              <w:t xml:space="preserve"> Asitli toprağa kireç serpilmesi</w:t>
             </w:r>
           </w:p>
         </w:tc>
       </w:tr>
     </w:tbl>
-    <w:p>
-      <w:pPr>
-        <w:jc w:val="both"/>
-        <w:rPr>
-          <w:rFonts w:ascii="Times New Roman" w:hAnsi="Times New Roman" w:cs="Times New Roman"/>
-          <w:lang w:val="tr-TR"/>
-        </w:rPr>
-      </w:pPr>
-    </w:p>
-    <w:p>
-      <w:pPr>
-        <w:jc w:val="center"/>
-        <w:rPr>
-          <w:rFonts w:ascii="Times New Roman" w:hAnsi="Times New Roman" w:cs="Times New Roman"/>
-          <w:lang w:val="tr-TR"/>
-        </w:rPr>
-      </w:pPr>
-      <w:r>
-        <w:rPr>
-          <w:rFonts w:ascii="Times New Roman" w:hAnsi="Times New Roman" w:cs="Times New Roman"/>
-          <w:b/>
-          <w:bCs/>
-          <w:lang w:val="tr-TR"/>
-        </w:rPr>
-        <w:t xml:space="preserve">Görsel A:</w:t>
-      </w:r>
-      <w:r>
-        <w:rPr>
-          <w:rFonts w:ascii="Times New Roman" w:hAnsi="Times New Roman" w:cs="Times New Roman"/>
-          <w:lang w:val="tr-TR"/>
-        </w:rPr>
-        <w:t xml:space="preserve"> Mide rahatsızlığında kullanılan antasit tabletler</w:t>
-      </w:r>
-    </w:p>
-    <w:tbl>
-      <w:tblPr>
-        <w:tblW w:w="9000" w:type="dxa"/>
-        <w:jc w:val="center"/>
-        <w:tblBorders>
-          <w:top w:val="single" w:sz="8" w:space="0" w:color="7F7F7F"/>
-          <w:left w:val="single" w:sz="8" w:space="0" w:color="7F7F7F"/>
-          <w:bottom w:val="single" w:sz="8" w:space="0" w:color="7F7F7F"/>
-          <w:right w:val="single" w:sz="8" w:space="0" w:color="7F7F7F"/>
-        </w:tblBorders>
-      </w:tblPr>
-      <w:tblGrid>
-        <w:gridCol w:w="9000"/>
-      </w:tblGrid>
-      <w:tr>
-        <w:tc>
-          <w:tcPr>
-            <w:tcW w:w="9000" w:type="dxa"/>
-            <w:shd w:val="clear" w:color="auto" w:fill="EDEDED"/>
-          </w:tcPr>
-          <w:p>
-            <w:pPr>
-              <w:jc w:val="both"/>
-              <w:rPr>
-                <w:rFonts w:ascii="Times New Roman" w:hAnsi="Times New Roman" w:cs="Times New Roman"/>
-                <w:lang w:val="tr-TR"/>
-              </w:rPr>
-            </w:pPr>
-            <w:r>
-              <w:rPr>
-                <w:rFonts w:ascii="Times New Roman" w:hAnsi="Times New Roman" w:cs="Times New Roman"/>
-                <w:lang w:val="tr-TR"/>
-              </w:rPr>
-              <w:t xml:space="preserve">GÖRSEL ALANI (Shutterstock)</w:t>
-            </w:r>
-          </w:p>
-          <w:p>
-            <w:pPr>
-              <w:jc w:val="both"/>
-              <w:rPr>
-                <w:rFonts w:ascii="Times New Roman" w:hAnsi="Times New Roman" w:cs="Times New Roman"/>
-                <w:lang w:val="tr-TR"/>
-              </w:rPr>
-            </w:pPr>
-            <w:r>
-              <w:rPr>
-                <w:rFonts w:ascii="Times New Roman" w:hAnsi="Times New Roman" w:cs="Times New Roman"/>
-                <w:lang w:val="tr-TR"/>
-              </w:rPr>
-              <w:t xml:space="preserve">Tarif: Tarlaya ya da bahçe toprağına beyaz toz hâlinde tarım kireci serpen eller veya traktör.</w:t>
-            </w:r>
-          </w:p>
-          <w:p>
-            <w:pPr>
-              <w:jc w:val="both"/>
-              <w:rPr>
-                <w:rFonts w:ascii="Times New Roman" w:hAnsi="Times New Roman" w:cs="Times New Roman"/>
-                <w:lang w:val="tr-TR"/>
-              </w:rPr>
-            </w:pPr>
-            <w:r>
-              <w:rPr>
-                <w:rFonts w:ascii="Times New Roman" w:hAnsi="Times New Roman" w:cs="Times New Roman"/>
-                <w:lang w:val="tr-TR"/>
-              </w:rPr>
-              <w:t xml:space="preserve">Shutter ID: 2565145733 (fotoğraf) — Hand holding dolomite lime spread over soil</w:t>
-            </w:r>
-          </w:p>
-        </w:tc>
-      </w:tr>
-    </w:tbl>
-    <w:p>
-      <w:pPr>
-        <w:jc w:val="both"/>
-        <w:rPr>
-          <w:rFonts w:ascii="Times New Roman" w:hAnsi="Times New Roman" w:cs="Times New Roman"/>
-          <w:lang w:val="tr-TR"/>
-        </w:rPr>
-      </w:pPr>
-    </w:p>
-    <w:p>
-      <w:pPr>
-        <w:jc w:val="center"/>
-        <w:rPr>
-          <w:rFonts w:ascii="Times New Roman" w:hAnsi="Times New Roman" w:cs="Times New Roman"/>
-          <w:lang w:val="tr-TR"/>
-        </w:rPr>
-      </w:pPr>
-      <w:r>
-        <w:rPr>
-          <w:rFonts w:ascii="Times New Roman" w:hAnsi="Times New Roman" w:cs="Times New Roman"/>
-          <w:b/>
-          <w:bCs/>
-          <w:lang w:val="tr-TR"/>
-        </w:rPr>
-        <w:t xml:space="preserve">Görsel B:</w:t>
-      </w:r>
-      <w:r>
-        <w:rPr>
-          <w:rFonts w:ascii="Times New Roman" w:hAnsi="Times New Roman" w:cs="Times New Roman"/>
-          <w:lang w:val="tr-TR"/>
-        </w:rPr>
-        <w:t xml:space="preserve"> Asitli toprağa kireç serpilmesi</w:t>
-      </w:r>
-    </w:p>
     <w:p>
       <w:pPr>
         <w:keepNext/>

</xml_diff>

<commit_message>
Gorsel alanlarina Shutterstock onizlemeleri eklenmeye baslandi (ilk 13 gorsel)
</commit_message>
<xml_diff>
--- a/Kim11-2-10-Notrallesme.docx
+++ b/Kim11-2-10-Notrallesme.docx
@@ -96,6 +96,45 @@
                       <w:lang w:val="tr-TR"/>
                     </w:rPr>
                     <w:t xml:space="preserve">GÖRSEL ALANI (Shutterstock)</w:t>
+                  </w:r>
+                </w:p>
+                <w:p>
+                  <w:pPr>
+                    <w:jc w:val="center"/>
+                  </w:pPr>
+                  <w:r>
+                    <w:drawing>
+                      <wp:inline xmlns:a="http://schemas.openxmlformats.org/drawingml/2006/main" xmlns:pic="http://schemas.openxmlformats.org/drawingml/2006/picture">
+                        <wp:extent cx="1656900" cy="2520000"/>
+                        <wp:docPr id="900012" name="Picture 900012"/>
+                        <wp:cNvGraphicFramePr>
+                          <a:graphicFrameLocks noChangeAspect="1"/>
+                        </wp:cNvGraphicFramePr>
+                        <a:graphic>
+                          <a:graphicData uri="http://schemas.openxmlformats.org/drawingml/2006/picture">
+                            <pic:pic>
+                              <pic:nvPicPr>
+                                <pic:cNvPr id="0" name="188016662_d.jpg"/>
+                                <pic:cNvPicPr/>
+                              </pic:nvPicPr>
+                              <pic:blipFill>
+                                <a:blip r:embed="rId11"/>
+                                <a:stretch>
+                                  <a:fillRect/>
+                                </a:stretch>
+                              </pic:blipFill>
+                              <pic:spPr>
+                                <a:xfrm>
+                                  <a:off x="0" y="0"/>
+                                  <a:ext cx="1656900" cy="2520000"/>
+                                </a:xfrm>
+                                <a:prstGeom prst="rect"/>
+                              </pic:spPr>
+                            </pic:pic>
+                          </a:graphicData>
+                        </a:graphic>
+                      </wp:inline>
+                    </w:drawing>
                   </w:r>
                 </w:p>
                 <w:p>

</xml_diff>

<commit_message>
Gorsel alanlari 2.3 bicimine cevrildi: gri kutu yerine gorsel + sari Shutter id satiri (onizlemesi inen 13 gorsel)
</commit_message>
<xml_diff>
--- a/Kim11-2-10-Notrallesme.docx
+++ b/Kim11-2-10-Notrallesme.docx
@@ -62,116 +62,60 @@
           <w:tcPr>
             <w:tcW w:w="4500" w:type="dxa"/>
           </w:tcPr>
-          <w:tbl>
-            <w:tblPr>
-              <w:tblW w:w="4300" w:type="dxa"/>
+          <w:p>
+            <w:pPr>
               <w:jc w:val="center"/>
-              <w:tblBorders>
-                <w:top w:val="single" w:sz="8" w:space="0" w:color="7F7F7F"/>
-                <w:left w:val="single" w:sz="8" w:space="0" w:color="7F7F7F"/>
-                <w:bottom w:val="single" w:sz="8" w:space="0" w:color="7F7F7F"/>
-                <w:right w:val="single" w:sz="8" w:space="0" w:color="7F7F7F"/>
-              </w:tblBorders>
-            </w:tblPr>
-            <w:tblGrid>
-              <w:gridCol w:w="4300"/>
-            </w:tblGrid>
-            <w:tr>
-              <w:tc>
-                <w:tcPr>
-                  <w:tcW w:w="4300" w:type="dxa"/>
-                  <w:shd w:val="clear" w:color="auto" w:fill="EDEDED"/>
-                </w:tcPr>
-                <w:p>
-                  <w:pPr>
-                    <w:jc w:val="both"/>
-                    <w:rPr>
-                      <w:rFonts w:ascii="Times New Roman" w:hAnsi="Times New Roman" w:cs="Times New Roman"/>
-                      <w:lang w:val="tr-TR"/>
-                    </w:rPr>
-                  </w:pPr>
-                  <w:r>
-                    <w:rPr>
-                      <w:rFonts w:ascii="Times New Roman" w:hAnsi="Times New Roman" w:cs="Times New Roman"/>
-                      <w:lang w:val="tr-TR"/>
-                    </w:rPr>
-                    <w:t xml:space="preserve">GÖRSEL ALANI (Shutterstock)</w:t>
-                  </w:r>
-                </w:p>
-                <w:p>
-                  <w:pPr>
-                    <w:jc w:val="center"/>
-                  </w:pPr>
-                  <w:r>
-                    <w:drawing>
-                      <wp:inline xmlns:a="http://schemas.openxmlformats.org/drawingml/2006/main" xmlns:pic="http://schemas.openxmlformats.org/drawingml/2006/picture">
-                        <wp:extent cx="1656900" cy="2520000"/>
-                        <wp:docPr id="900012" name="Picture 900012"/>
-                        <wp:cNvGraphicFramePr>
-                          <a:graphicFrameLocks noChangeAspect="1"/>
-                        </wp:cNvGraphicFramePr>
-                        <a:graphic>
-                          <a:graphicData uri="http://schemas.openxmlformats.org/drawingml/2006/picture">
-                            <pic:pic>
-                              <pic:nvPicPr>
-                                <pic:cNvPr id="0" name="188016662_d.jpg"/>
-                                <pic:cNvPicPr/>
-                              </pic:nvPicPr>
-                              <pic:blipFill>
-                                <a:blip r:embed="rId11"/>
-                                <a:stretch>
-                                  <a:fillRect/>
-                                </a:stretch>
-                              </pic:blipFill>
-                              <pic:spPr>
-                                <a:xfrm>
-                                  <a:off x="0" y="0"/>
-                                  <a:ext cx="1656900" cy="2520000"/>
-                                </a:xfrm>
-                                <a:prstGeom prst="rect"/>
-                              </pic:spPr>
-                            </pic:pic>
-                          </a:graphicData>
-                        </a:graphic>
-                      </wp:inline>
-                    </w:drawing>
-                  </w:r>
-                </w:p>
-                <w:p>
-                  <w:pPr>
-                    <w:jc w:val="both"/>
-                    <w:rPr>
-                      <w:rFonts w:ascii="Times New Roman" w:hAnsi="Times New Roman" w:cs="Times New Roman"/>
-                      <w:lang w:val="tr-TR"/>
-                    </w:rPr>
-                  </w:pPr>
-                  <w:r>
-                    <w:rPr>
-                      <w:rFonts w:ascii="Times New Roman" w:hAnsi="Times New Roman" w:cs="Times New Roman"/>
-                      <w:lang w:val="tr-TR"/>
-                    </w:rPr>
-                    <w:t xml:space="preserve">Tarif: Bir bardak su yanında çiğnenebilir antasit tabletler; marka ve logo görünmesin.</w:t>
-                  </w:r>
-                </w:p>
-                <w:p>
-                  <w:pPr>
-                    <w:jc w:val="both"/>
-                    <w:rPr>
-                      <w:rFonts w:ascii="Times New Roman" w:hAnsi="Times New Roman" w:cs="Times New Roman"/>
-                      <w:lang w:val="tr-TR"/>
-                    </w:rPr>
-                  </w:pPr>
-                  <w:r>
-                    <w:rPr>
-                      <w:rFonts w:ascii="Times New Roman" w:hAnsi="Times New Roman" w:cs="Times New Roman"/>
-                      <w:lang w:val="tr-TR"/>
-                    </w:rPr>
-                    <w:t xml:space="preserve">Shutter ID: 188016662 (fotoğraf) — Effervescent antacid tablet in glass of water</w:t>
-                  </w:r>
-                </w:p>
-              </w:tc>
-            </w:tr>
-          </w:tbl>
+            </w:pPr>
+            <w:r>
+              <w:drawing>
+                <wp:inline xmlns:a="http://schemas.openxmlformats.org/drawingml/2006/main" xmlns:pic="http://schemas.openxmlformats.org/drawingml/2006/picture">
+                  <wp:extent cx="1301850" cy="1980000"/>
+                  <wp:docPr id="900012" name="Picture 900012"/>
+                  <wp:cNvGraphicFramePr>
+                    <a:graphicFrameLocks noChangeAspect="1"/>
+                  </wp:cNvGraphicFramePr>
+                  <a:graphic>
+                    <a:graphicData uri="http://schemas.openxmlformats.org/drawingml/2006/picture">
+                      <pic:pic>
+                        <pic:nvPicPr>
+                          <pic:cNvPr id="0" name="188016662_d.jpg"/>
+                          <pic:cNvPicPr/>
+                        </pic:nvPicPr>
+                        <pic:blipFill>
+                          <a:blip r:embed="rId11"/>
+                          <a:stretch>
+                            <a:fillRect/>
+                          </a:stretch>
+                        </pic:blipFill>
+                        <pic:spPr>
+                          <a:xfrm>
+                            <a:off x="0" y="0"/>
+                            <a:ext cx="1301850" cy="1980000"/>
+                          </a:xfrm>
+                          <a:prstGeom prst="rect"/>
+                        </pic:spPr>
+                      </pic:pic>
+                    </a:graphicData>
+                  </a:graphic>
+                </wp:inline>
+              </w:drawing>
+            </w:r>
+          </w:p>
+          <w:p>
+            <w:pPr>
+              <w:jc w:val="center"/>
+            </w:pPr>
+            <w:r>
+              <w:rPr>
+                <w:rFonts w:ascii="Times New Roman" w:hAnsi="Times New Roman" w:cs="Times New Roman"/>
+                <w:b/>
+                <w:bCs/>
+                <w:highlight w:val="yellow"/>
+                <w:lang w:val="tr-TR"/>
+              </w:rPr>
+              <w:t xml:space="preserve">Shutter id: 188016662</w:t>
+            </w:r>
+          </w:p>
           <w:p>
             <w:pPr>
               <w:jc w:val="center"/>

</xml_diff>

<commit_message>
Kim11-2-10-Notrallesme: gorsel alanlarina Shutter onizlemeleri yerlestirildi (2.3 bicimi)
</commit_message>
<xml_diff>
--- a/Kim11-2-10-Notrallesme.docx
+++ b/Kim11-2-10-Notrallesme.docx
@@ -146,77 +146,60 @@
           <w:tcPr>
             <w:tcW w:w="4500" w:type="dxa"/>
           </w:tcPr>
-          <w:tbl>
-            <w:tblPr>
-              <w:tblW w:w="4300" w:type="dxa"/>
+          <w:p>
+            <w:pPr>
               <w:jc w:val="center"/>
-              <w:tblBorders>
-                <w:top w:val="single" w:sz="8" w:space="0" w:color="7F7F7F"/>
-                <w:left w:val="single" w:sz="8" w:space="0" w:color="7F7F7F"/>
-                <w:bottom w:val="single" w:sz="8" w:space="0" w:color="7F7F7F"/>
-                <w:right w:val="single" w:sz="8" w:space="0" w:color="7F7F7F"/>
-              </w:tblBorders>
-            </w:tblPr>
-            <w:tblGrid>
-              <w:gridCol w:w="4300"/>
-            </w:tblGrid>
-            <w:tr>
-              <w:tc>
-                <w:tcPr>
-                  <w:tcW w:w="4300" w:type="dxa"/>
-                  <w:shd w:val="clear" w:color="auto" w:fill="EDEDED"/>
-                </w:tcPr>
-                <w:p>
-                  <w:pPr>
-                    <w:jc w:val="both"/>
-                    <w:rPr>
-                      <w:rFonts w:ascii="Times New Roman" w:hAnsi="Times New Roman" w:cs="Times New Roman"/>
-                      <w:lang w:val="tr-TR"/>
-                    </w:rPr>
-                  </w:pPr>
-                  <w:r>
-                    <w:rPr>
-                      <w:rFonts w:ascii="Times New Roman" w:hAnsi="Times New Roman" w:cs="Times New Roman"/>
-                      <w:lang w:val="tr-TR"/>
-                    </w:rPr>
-                    <w:t xml:space="preserve">GÖRSEL ALANI (Shutterstock)</w:t>
-                  </w:r>
-                </w:p>
-                <w:p>
-                  <w:pPr>
-                    <w:jc w:val="both"/>
-                    <w:rPr>
-                      <w:rFonts w:ascii="Times New Roman" w:hAnsi="Times New Roman" w:cs="Times New Roman"/>
-                      <w:lang w:val="tr-TR"/>
-                    </w:rPr>
-                  </w:pPr>
-                  <w:r>
-                    <w:rPr>
-                      <w:rFonts w:ascii="Times New Roman" w:hAnsi="Times New Roman" w:cs="Times New Roman"/>
-                      <w:lang w:val="tr-TR"/>
-                    </w:rPr>
-                    <w:t xml:space="preserve">Tarif: Tarlaya ya da bahçe toprağına beyaz toz hâlinde tarım kireci serpen eller veya traktör.</w:t>
-                  </w:r>
-                </w:p>
-                <w:p>
-                  <w:pPr>
-                    <w:jc w:val="both"/>
-                    <w:rPr>
-                      <w:rFonts w:ascii="Times New Roman" w:hAnsi="Times New Roman" w:cs="Times New Roman"/>
-                      <w:lang w:val="tr-TR"/>
-                    </w:rPr>
-                  </w:pPr>
-                  <w:r>
-                    <w:rPr>
-                      <w:rFonts w:ascii="Times New Roman" w:hAnsi="Times New Roman" w:cs="Times New Roman"/>
-                      <w:lang w:val="tr-TR"/>
-                    </w:rPr>
-                    <w:t xml:space="preserve">Shutter ID: 2565145733 (fotoğraf) — Hand holding dolomite lime spread over soil</w:t>
-                  </w:r>
-                </w:p>
-              </w:tc>
-            </w:tr>
-          </w:tbl>
+            </w:pPr>
+            <w:r>
+              <w:drawing>
+                <wp:inline xmlns:a="http://schemas.openxmlformats.org/drawingml/2006/main" xmlns:pic="http://schemas.openxmlformats.org/drawingml/2006/picture">
+                  <wp:extent cx="2424489" cy="1979999"/>
+                  <wp:docPr id="900013" name="Picture 900013"/>
+                  <wp:cNvGraphicFramePr>
+                    <a:graphicFrameLocks noChangeAspect="1"/>
+                  </wp:cNvGraphicFramePr>
+                  <a:graphic>
+                    <a:graphicData uri="http://schemas.openxmlformats.org/drawingml/2006/picture">
+                      <pic:pic>
+                        <pic:nvPicPr>
+                          <pic:cNvPr id="0" name="2565145733_d.jpg"/>
+                          <pic:cNvPicPr/>
+                        </pic:nvPicPr>
+                        <pic:blipFill>
+                          <a:blip r:embed="rId12"/>
+                          <a:stretch>
+                            <a:fillRect/>
+                          </a:stretch>
+                        </pic:blipFill>
+                        <pic:spPr>
+                          <a:xfrm>
+                            <a:off x="0" y="0"/>
+                            <a:ext cx="2424489" cy="1979999"/>
+                          </a:xfrm>
+                          <a:prstGeom prst="rect"/>
+                        </pic:spPr>
+                      </pic:pic>
+                    </a:graphicData>
+                  </a:graphic>
+                </wp:inline>
+              </w:drawing>
+            </w:r>
+          </w:p>
+          <w:p>
+            <w:pPr>
+              <w:jc w:val="center"/>
+            </w:pPr>
+            <w:r>
+              <w:rPr>
+                <w:rFonts w:ascii="Times New Roman" w:hAnsi="Times New Roman" w:cs="Times New Roman"/>
+                <w:b/>
+                <w:bCs/>
+                <w:highlight w:val="yellow"/>
+                <w:lang w:val="tr-TR"/>
+              </w:rPr>
+              <w:t xml:space="preserve">Shutter id: 2565145733</w:t>
+            </w:r>
+          </w:p>
           <w:p>
             <w:pPr>
               <w:jc w:val="center"/>

</xml_diff>

<commit_message>
2.10 Gorsel C: HBr, KOH ve karisim alt mikro modeli gercek geometri ve atom/iyon yaricaplariyla uzay dolgu olarak, baski boyutunda yeniden cizildi
</commit_message>
<xml_diff>
--- a/Kim11-2-10-Notrallesme.docx
+++ b/Kim11-2-10-Notrallesme.docx
@@ -3721,7 +3721,7 @@
       <w:r>
         <w:drawing>
           <wp:inline distT="0" distB="0" distL="0" distR="0">
-            <wp:extent cx="5398018" cy="2697485"/>
+            <wp:extent cx="5398018" cy="2932181"/>
             <wp:docPr id="900005" name="Grafik 900005" descr="HBr-KOH nötralleşmesi alt mikro model"/>
             <wp:cNvGraphicFramePr>
               <a:graphicFrameLocks noChangeAspect="1"/>
@@ -3742,7 +3742,7 @@
                   <pic:spPr>
                     <a:xfrm>
                       <a:off x="0" y="0"/>
-                      <a:ext cx="5398018" cy="2697485"/>
+                      <a:ext cx="5398018" cy="2932181"/>
                     </a:xfrm>
                     <a:prstGeom prst="rect">
                       <a:avLst/>

</xml_diff>